<commit_message>
Uplode: image to jar in lab1 programming
</commit_message>
<xml_diff>
--- a/opd/lab1/report.docx
+++ b/opd/lab1/report.docx
@@ -643,6 +643,7 @@
         <w:jc w:val="center"/>
         <w:rPr>
           <w:rFonts w:ascii="Times New Roman" w:hAnsi="Times New Roman" w:cs="Times New Roman"/>
+          <w:lang w:val="en-US"/>
         </w:rPr>
       </w:pPr>
       <w:r>
@@ -651,6 +652,18 @@
         </w:rPr>
         <w:t>Ход работы</w:t>
       </w:r>
+    </w:p>
+    <w:p>
+      <w:pPr>
+        <w:pStyle w:val="a7"/>
+        <w:numPr>
+          <w:ilvl w:val="0"/>
+          <w:numId w:val="3"/>
+        </w:numPr>
+        <w:rPr>
+          <w:rFonts w:ascii="Times New Roman" w:hAnsi="Times New Roman" w:cs="Times New Roman"/>
+        </w:rPr>
+      </w:pPr>
     </w:p>
     <w:p>
       <w:pPr>
@@ -1269,6 +1282,7 @@
       <w:r>
         <w:rPr>
           <w:rFonts w:ascii="Times New Roman" w:hAnsi="Times New Roman" w:cs="Times New Roman"/>
+          <w:noProof/>
           <w:lang w:val="en-US"/>
         </w:rPr>
         <w:drawing>
@@ -1364,6 +1378,7 @@
       <w:r>
         <w:rPr>
           <w:rFonts w:ascii="Times New Roman" w:hAnsi="Times New Roman" w:cs="Times New Roman"/>
+          <w:noProof/>
           <w:lang w:val="en-US"/>
         </w:rPr>
         <w:lastRenderedPageBreak/>
@@ -1433,6 +1448,7 @@
       <w:r>
         <w:rPr>
           <w:rFonts w:ascii="Times New Roman" w:hAnsi="Times New Roman" w:cs="Times New Roman"/>
+          <w:noProof/>
           <w:lang w:val="en-US"/>
         </w:rPr>
         <w:drawing>
@@ -1504,6 +1520,7 @@
       <w:r>
         <w:rPr>
           <w:rFonts w:ascii="Times New Roman" w:hAnsi="Times New Roman" w:cs="Times New Roman"/>
+          <w:noProof/>
         </w:rPr>
         <w:drawing>
           <wp:inline distT="0" distB="0" distL="0" distR="0" wp14:anchorId="46F2AECE" wp14:editId="231442D2">
@@ -1569,6 +1586,7 @@
       <w:r>
         <w:rPr>
           <w:rFonts w:ascii="Times New Roman" w:hAnsi="Times New Roman" w:cs="Times New Roman"/>
+          <w:noProof/>
         </w:rPr>
         <w:drawing>
           <wp:inline distT="0" distB="0" distL="0" distR="0" wp14:anchorId="7B760BBF" wp14:editId="3B5226AF">
@@ -1882,6 +1900,7 @@
       <w:r>
         <w:rPr>
           <w:rFonts w:ascii="Times New Roman" w:hAnsi="Times New Roman" w:cs="Times New Roman"/>
+          <w:noProof/>
         </w:rPr>
         <w:drawing>
           <wp:inline distT="0" distB="0" distL="0" distR="0" wp14:anchorId="7AC0F217" wp14:editId="26AC9A33">
@@ -2012,6 +2031,7 @@
       <w:r>
         <w:rPr>
           <w:rFonts w:ascii="Times New Roman" w:hAnsi="Times New Roman" w:cs="Times New Roman"/>
+          <w:noProof/>
           <w:lang w:val="en-US"/>
         </w:rPr>
         <w:drawing>
@@ -2977,6 +2997,7 @@
   <w:style w:type="character" w:default="1" w:styleId="a0">
     <w:name w:val="Default Paragraph Font"/>
     <w:uiPriority w:val="1"/>
+    <w:semiHidden/>
     <w:unhideWhenUsed/>
   </w:style>
   <w:style w:type="table" w:default="1" w:styleId="a1">

</xml_diff>